<commit_message>
Add LinkedIn and GitHub repo links to proposal
</commit_message>
<xml_diff>
--- a/docs/Road_to_Devcon8_Proposal.docx
+++ b/docs/Road_to_Devcon8_Proposal.docx
@@ -5155,7 +5155,9 @@
           <w:sz w:val="24"/>
           <w:szCs w:val="24"/>
         </w:rPr>
-        <w:t xml:space="preserve">YouTube recording of our sessions:</w:t>
+        <w:t xml:space="preserve">GitHub Repository (proposal, feedback data, poll screenshots):
+https://github.com/kiranvk-code/cypher-space-road-to-devcon
+YouTube recording of our sessions:</w:t>
       </w:r>
     </w:p>
     <w:p>
@@ -5293,7 +5295,8 @@
           <w:sz w:val="24"/>
           <w:szCs w:val="24"/>
         </w:rPr>
-        <w:t xml:space="preserve">Email: kiranvk@nssce.ac.in</w:t>
+        <w:t xml:space="preserve">Email: kiranvk@nssce.ac.in
+LinkedIn: https://www.linkedin.com/in/kiranvk-kvk/</w:t>
       </w:r>
     </w:p>
     <w:p>

</xml_diff>

<commit_message>
Fix: Telegram → WhatsApp for poll references
</commit_message>
<xml_diff>
--- a/docs/Road_to_Devcon8_Proposal.docx
+++ b/docs/Road_to_Devcon8_Proposal.docx
@@ -1960,7 +1960,7 @@
           <w:sz w:val="24"/>
           <w:szCs w:val="24"/>
         </w:rPr>
-        <w:t xml:space="preserve">Beyond historical feedback, we surveyed our active community to gauge forward-looking interest in different types of blockchain events. The data below comes from recent Telegram polls conducted among 44 members of the Cypher Space Blockchain Club.</w:t>
+        <w:t xml:space="preserve">Beyond historical feedback, we surveyed our active community to gauge forward-looking interest in different types of blockchain events. The data below comes from recent WhatsApp polls conducted among 44 members of the Cypher Space Blockchain Club.</w:t>
       </w:r>
     </w:p>
     <w:p>
@@ -5123,7 +5123,7 @@
           <w:sz w:val="24"/>
           <w:szCs w:val="24"/>
         </w:rPr>
-        <w:t xml:space="preserve">Student_Poll_Data/ — Screenshots of 3 Telegram polls showing community interest and demand</w:t>
+        <w:t xml:space="preserve">Student_Poll_Data/ — Screenshots of 3 WhatsApp polls showing community interest and demand</w:t>
       </w:r>
     </w:p>
     <w:p>

</xml_diff>